<commit_message>
Dossier DEETS v4 : Rendez-vous le mardi en journée, logo, CV et titre FPA, échéancier des obligations, planning de pilotage personnel
Co-Authored-By: Claude Opus 5.5 <noreply@anthropic.com>
Claude-Session: https://claude.ai/code/session_01XmXRuHREkUhS4BvVjcPE7t
</commit_message>
<xml_diff>
--- a/dossier-deets-apprentissage/word/00_Bordereau_d_envoi.docx
+++ b/dossier-deets-apprentissage/word/00_Bordereau_d_envoi.docx
@@ -4,29 +4,47 @@
   <w:body>
     <w:p>
       <w:pPr>
-        <w:spacing w:after="40"/>
+        <w:spacing w:after="80"/>
       </w:pPr>
       <w:r>
-        <w:rPr>
-          <w:rFonts w:ascii="Montserrat" w:cs="Montserrat" w:eastAsia="Montserrat" w:hAnsi="Montserrat"/>
-          <w:b/>
-          <w:bCs/>
-          <w:color w:val="1B3A6B"/>
-          <w:sz w:val="40"/>
-          <w:szCs w:val="40"/>
-        </w:rPr>
-        <w:t xml:space="preserve">YEBA</w:t>
-      </w:r>
-      <w:r>
-        <w:rPr>
-          <w:rFonts w:ascii="Montserrat" w:cs="Montserrat" w:eastAsia="Montserrat" w:hAnsi="Montserrat"/>
-          <w:b/>
-          <w:bCs/>
-          <w:color w:val="C9AB4C"/>
-          <w:sz w:val="40"/>
-          <w:szCs w:val="40"/>
-        </w:rPr>
-        <w:t xml:space="preserve">  FORMATIONS</w:t>
+        <w:drawing>
+          <wp:inline distT="0" distB="0" distL="0" distR="0">
+            <wp:extent cx="1143000" cy="971550"/>
+            <wp:effectExtent t="0" r="0" b="0" l="0"/>
+            <wp:docPr id="1" name="logo" descr="Logo YEBA FORMATIONS" title="Logo YEBA FORMATIONS"/>
+            <wp:cNvGraphicFramePr>
+              <a:graphicFrameLocks xmlns:a="http://schemas.openxmlformats.org/drawingml/2006/main" noChangeAspect="1"/>
+            </wp:cNvGraphicFramePr>
+            <a:graphic xmlns:a="http://schemas.openxmlformats.org/drawingml/2006/main">
+              <a:graphicData uri="http://schemas.openxmlformats.org/drawingml/2006/picture">
+                <pic:pic xmlns:pic="http://schemas.openxmlformats.org/drawingml/2006/picture">
+                  <pic:nvPicPr>
+                    <pic:cNvPr id="0" name="" descr=""/>
+                    <pic:cNvPicPr>
+                      <a:picLocks noChangeAspect="1" noChangeArrowheads="1"/>
+                    </pic:cNvPicPr>
+                  </pic:nvPicPr>
+                  <pic:blipFill>
+                    <a:blip r:embed="rId9" cstate="none"/>
+                    <a:srcRect/>
+                    <a:stretch>
+                      <a:fillRect/>
+                    </a:stretch>
+                  </pic:blipFill>
+                  <pic:spPr bwMode="auto">
+                    <a:xfrm>
+                      <a:off x="0" y="0"/>
+                      <a:ext cx="1143000" cy="971550"/>
+                    </a:xfrm>
+                    <a:prstGeom prst="rect">
+                      <a:avLst/>
+                    </a:prstGeom>
+                  </pic:spPr>
+                </pic:pic>
+              </a:graphicData>
+            </a:graphic>
+          </wp:inline>
+        </w:drawing>
       </w:r>
     </w:p>
     <w:p>
@@ -512,7 +530,7 @@
               <w:rPr>
                 <w:rFonts w:ascii="Inter" w:cs="Inter" w:eastAsia="Inter" w:hAnsi="Inter"/>
               </w:rPr>
-              <w:t xml:space="preserve">Aurélien LUMEKA, Directeur</w:t>
+              <w:t xml:space="preserve">Aurélien LUMEKA, Directeur — +262 693 32 24 45 — yebaformations@gmail.com</w:t>
             </w:r>
           </w:p>
         </w:tc>
@@ -565,7 +583,7 @@
               <w:rPr>
                 <w:rFonts w:ascii="Inter" w:cs="Inter" w:eastAsia="Inter" w:hAnsi="Inter"/>
               </w:rPr>
-              <w:t xml:space="preserve">Version 2 du 28/10/2026</w:t>
+              <w:t xml:space="preserve">Version 3 du 30/10/2026</w:t>
             </w:r>
           </w:p>
         </w:tc>

</xml_diff>

<commit_message>
Dossier DEETS v5 : rythme du mardi + 2 semaines intensives, certificat Qualiopi apprentissage, adresse administrative
Co-Authored-By: Claude Opus 5.5 <noreply@anthropic.com>
Claude-Session: https://claude.ai/code/session_01XmXRuHREkUhS4BvVjcPE7t
</commit_message>
<xml_diff>
--- a/dossier-deets-apprentissage/word/00_Bordereau_d_envoi.docx
+++ b/dossier-deets-apprentissage/word/00_Bordereau_d_envoi.docx
@@ -455,7 +455,7 @@
               <w:rPr>
                 <w:rFonts w:ascii="Inter" w:cs="Inter" w:eastAsia="Inter" w:hAnsi="Inter"/>
               </w:rPr>
-              <w:t xml:space="preserve">Certification Qualiopi</w:t>
+              <w:t xml:space="preserve">Adresse administrative (courrier)</w:t>
             </w:r>
           </w:p>
         </w:tc>
@@ -473,13 +473,13 @@
           <w:p>
             <w:pPr>
               <w:spacing w:after="40"/>
-              <w:jc w:val="both"/>
-            </w:pPr>
-            <w:r>
-              <w:rPr>
-                <w:rFonts w:ascii="Inter" w:cs="Inter" w:eastAsia="Inter" w:hAnsi="Inter"/>
-              </w:rPr>
-              <w:t xml:space="preserve">n° 25FOR02027.1 (actions de formation). Extension à la catégorie « actions de formation par apprentissage » engagée : l’audit d’extension sera réalisé dès l’entrée en formation du premier apprenti (courriel de l’organisme certificateur du 14/10/2026).</w:t>
+              <w:jc w:val="left"/>
+            </w:pPr>
+            <w:r>
+              <w:rPr>
+                <w:rFonts w:ascii="Inter" w:cs="Inter" w:eastAsia="Inter" w:hAnsi="Inter"/>
+              </w:rPr>
+              <w:t xml:space="preserve">9 rue Françoise Châtelain, Bâtiment A, Entrée 1, Porte 0042, 97490 Saint-Denis</w:t>
             </w:r>
           </w:p>
         </w:tc>
@@ -507,7 +507,7 @@
               <w:rPr>
                 <w:rFonts w:ascii="Inter" w:cs="Inter" w:eastAsia="Inter" w:hAnsi="Inter"/>
               </w:rPr>
-              <w:t xml:space="preserve">Responsable</w:t>
+              <w:t xml:space="preserve">Certification Qualiopi</w:t>
             </w:r>
           </w:p>
         </w:tc>
@@ -524,13 +524,27 @@
           <w:p>
             <w:pPr>
               <w:spacing w:after="40"/>
-              <w:jc w:val="left"/>
-            </w:pPr>
-            <w:r>
-              <w:rPr>
-                <w:rFonts w:ascii="Inter" w:cs="Inter" w:eastAsia="Inter" w:hAnsi="Inter"/>
-              </w:rPr>
-              <w:t xml:space="preserve">Aurélien LUMEKA, Directeur — +262 693 32 24 45 — yebaformations@gmail.com</w:t>
+              <w:jc w:val="both"/>
+            </w:pPr>
+            <w:r>
+              <w:rPr>
+                <w:rFonts w:ascii="Inter" w:cs="Inter" w:eastAsia="Inter" w:hAnsi="Inter"/>
+              </w:rPr>
+              <w:t xml:space="preserve">n° 25FOR02027.1, délivrée par QUALITIA Certification, valable du 17/02/2026 au 16/02/2029. Catégories certifiées (art. L.6313-1 du Code du travail) : actions de formation, bilans de compétences, actions de validation des acquis de l’expérience et </w:t>
+            </w:r>
+            <w:r>
+              <w:rPr>
+                <w:rFonts w:ascii="Inter" w:cs="Inter" w:eastAsia="Inter" w:hAnsi="Inter"/>
+                <w:b/>
+                <w:bCs/>
+              </w:rPr>
+              <w:t xml:space="preserve">actions de formation par apprentissage</w:t>
+            </w:r>
+            <w:r>
+              <w:rPr>
+                <w:rFonts w:ascii="Inter" w:cs="Inter" w:eastAsia="Inter" w:hAnsi="Inter"/>
+              </w:rPr>
+              <w:t xml:space="preserve">.</w:t>
             </w:r>
           </w:p>
         </w:tc>
@@ -559,6 +573,58 @@
               <w:rPr>
                 <w:rFonts w:ascii="Inter" w:cs="Inter" w:eastAsia="Inter" w:hAnsi="Inter"/>
               </w:rPr>
+              <w:t xml:space="preserve">Responsable</w:t>
+            </w:r>
+          </w:p>
+        </w:tc>
+        <w:tc>
+          <w:tcPr>
+            <w:tcW w:type="dxa" w:w="7038"/>
+            <w:shd w:fill="EEF1F6" w:color="auto" w:val="clear"/>
+            <w:tcMar>
+              <w:top w:type="dxa" w:w="60"/>
+              <w:left w:type="dxa" w:w="90"/>
+              <w:bottom w:type="dxa" w:w="60"/>
+              <w:right w:type="dxa" w:w="90"/>
+            </w:tcMar>
+          </w:tcPr>
+          <w:p>
+            <w:pPr>
+              <w:spacing w:after="40"/>
+              <w:jc w:val="left"/>
+            </w:pPr>
+            <w:r>
+              <w:rPr>
+                <w:rFonts w:ascii="Inter" w:cs="Inter" w:eastAsia="Inter" w:hAnsi="Inter"/>
+              </w:rPr>
+              <w:t xml:space="preserve">Aurélien LUMEKA, Directeur — +262 693 32 24 45 — yebaformations@gmail.com</w:t>
+            </w:r>
+          </w:p>
+        </w:tc>
+      </w:tr>
+      <w:tr>
+        <w:trPr>
+          <w:cantSplit/>
+        </w:trPr>
+        <w:tc>
+          <w:tcPr>
+            <w:tcW w:type="dxa" w:w="2600"/>
+            <w:tcMar>
+              <w:top w:type="dxa" w:w="60"/>
+              <w:left w:type="dxa" w:w="90"/>
+              <w:bottom w:type="dxa" w:w="60"/>
+              <w:right w:type="dxa" w:w="90"/>
+            </w:tcMar>
+          </w:tcPr>
+          <w:p>
+            <w:pPr>
+              <w:spacing w:after="40"/>
+              <w:jc w:val="left"/>
+            </w:pPr>
+            <w:r>
+              <w:rPr>
+                <w:rFonts w:ascii="Inter" w:cs="Inter" w:eastAsia="Inter" w:hAnsi="Inter"/>
+              </w:rPr>
               <w:t xml:space="preserve">Version</w:t>
             </w:r>
           </w:p>
@@ -566,24 +632,23 @@
         <w:tc>
           <w:tcPr>
             <w:tcW w:type="dxa" w:w="7038"/>
-            <w:shd w:fill="EEF1F6" w:color="auto" w:val="clear"/>
-            <w:tcMar>
-              <w:top w:type="dxa" w:w="60"/>
-              <w:left w:type="dxa" w:w="90"/>
-              <w:bottom w:type="dxa" w:w="60"/>
-              <w:right w:type="dxa" w:w="90"/>
-            </w:tcMar>
-          </w:tcPr>
-          <w:p>
-            <w:pPr>
-              <w:spacing w:after="40"/>
-              <w:jc w:val="left"/>
-            </w:pPr>
-            <w:r>
-              <w:rPr>
-                <w:rFonts w:ascii="Inter" w:cs="Inter" w:eastAsia="Inter" w:hAnsi="Inter"/>
-              </w:rPr>
-              <w:t xml:space="preserve">Version 3 du 30/10/2026</w:t>
+            <w:tcMar>
+              <w:top w:type="dxa" w:w="60"/>
+              <w:left w:type="dxa" w:w="90"/>
+              <w:bottom w:type="dxa" w:w="60"/>
+              <w:right w:type="dxa" w:w="90"/>
+            </w:tcMar>
+          </w:tcPr>
+          <w:p>
+            <w:pPr>
+              <w:spacing w:after="40"/>
+              <w:jc w:val="left"/>
+            </w:pPr>
+            <w:r>
+              <w:rPr>
+                <w:rFonts w:ascii="Inter" w:cs="Inter" w:eastAsia="Inter" w:hAnsi="Inter"/>
+              </w:rPr>
+              <w:t xml:space="preserve">Version 4 du 30/10/2026</w:t>
             </w:r>
           </w:p>
         </w:tc>

</xml_diff>